<commit_message>
ejercicio redes neuronales terminado
</commit_message>
<xml_diff>
--- a/redes_neuronales/ejercicios-redes-neuronales.docx
+++ b/redes_neuronales/ejercicios-redes-neuronales.docx
@@ -32,9 +32,15 @@
       <w:r>
         <w:t>No se puede separar los datos puesto que no hay ni capas ni neuronas para ello</w:t>
       </w:r>
-    </w:p>
-    <w:p>
-      <w:r>
+      <w:r>
+        <w:t>.</w:t>
+      </w:r>
+    </w:p>
+    <w:p>
+      <w:r>
+        <w:rPr>
+          <w:noProof/>
+        </w:rPr>
         <w:drawing>
           <wp:inline distT="0" distB="0" distL="0" distR="0" wp14:anchorId="361CEC30" wp14:editId="181AF1A3">
             <wp:extent cx="5400040" cy="3002280"/>
@@ -115,6 +121,9 @@
         <w:t>3 neuronas, pero es más preciso si utilizas 8, pero obviamente es mucho menos eficiente</w:t>
       </w:r>
       <w:r>
+        <w:t xml:space="preserve"> en cuanto a los recursos</w:t>
+      </w:r>
+      <w:r>
         <w:t>.</w:t>
       </w:r>
     </w:p>
@@ -123,6 +132,9 @@
         <w:pStyle w:val="Sinespaciado"/>
       </w:pPr>
       <w:r>
+        <w:rPr>
+          <w:noProof/>
+        </w:rPr>
         <w:drawing>
           <wp:inline distT="0" distB="0" distL="0" distR="0" wp14:anchorId="416CACCA" wp14:editId="577810CE">
             <wp:extent cx="3268980" cy="1763650"/>
@@ -170,6 +182,9 @@
         <w:pStyle w:val="Sinespaciado"/>
       </w:pPr>
       <w:r>
+        <w:rPr>
+          <w:noProof/>
+        </w:rPr>
         <w:drawing>
           <wp:inline distT="0" distB="0" distL="0" distR="0" wp14:anchorId="552DEAF7" wp14:editId="25335D20">
             <wp:extent cx="3238500" cy="1741113"/>
@@ -217,6 +232,9 @@
         <w:pStyle w:val="Sinespaciado"/>
       </w:pPr>
       <w:r>
+        <w:rPr>
+          <w:noProof/>
+        </w:rPr>
         <w:drawing>
           <wp:inline distT="0" distB="0" distL="0" distR="0" wp14:anchorId="1A92861F" wp14:editId="259789EF">
             <wp:extent cx="3552092" cy="1874205"/>
@@ -259,6 +277,9 @@
         <w:pStyle w:val="Sinespaciado"/>
       </w:pPr>
       <w:r>
+        <w:rPr>
+          <w:noProof/>
+        </w:rPr>
         <w:drawing>
           <wp:inline distT="0" distB="0" distL="0" distR="0" wp14:anchorId="18F6E1BF" wp14:editId="56A29640">
             <wp:extent cx="3634740" cy="1956280"/>
@@ -345,6 +366,9 @@
         <w:pStyle w:val="Sinespaciado"/>
       </w:pPr>
       <w:r>
+        <w:rPr>
+          <w:noProof/>
+        </w:rPr>
         <w:drawing>
           <wp:inline distT="0" distB="0" distL="0" distR="0" wp14:anchorId="20AEC378" wp14:editId="5301C974">
             <wp:extent cx="5400040" cy="2811145"/>
@@ -441,10 +465,13 @@
         <w:pStyle w:val="Sinespaciado"/>
       </w:pPr>
       <w:r>
+        <w:rPr>
+          <w:noProof/>
+        </w:rPr>
         <w:drawing>
-          <wp:inline distT="0" distB="0" distL="0" distR="0" wp14:anchorId="564B8EA5" wp14:editId="2060633E">
-            <wp:extent cx="3253740" cy="1729028"/>
-            <wp:effectExtent l="0" t="0" r="3810" b="5080"/>
+          <wp:inline distT="0" distB="0" distL="0" distR="0" wp14:anchorId="564B8EA5" wp14:editId="71E27FCC">
+            <wp:extent cx="3427154" cy="1821180"/>
+            <wp:effectExtent l="0" t="0" r="1905" b="7620"/>
             <wp:docPr id="1381181777" name="Imagen 1"/>
             <wp:cNvGraphicFramePr>
               <a:graphicFrameLocks xmlns:a="http://schemas.openxmlformats.org/drawingml/2006/main" noChangeAspect="1"/>
@@ -465,7 +492,7 @@
                   <pic:spPr>
                     <a:xfrm>
                       <a:off x="0" y="0"/>
-                      <a:ext cx="3263333" cy="1734126"/>
+                      <a:ext cx="3447338" cy="1831906"/>
                     </a:xfrm>
                     <a:prstGeom prst="rect">
                       <a:avLst/>
@@ -488,10 +515,13 @@
         <w:pStyle w:val="Sinespaciado"/>
       </w:pPr>
       <w:r>
+        <w:rPr>
+          <w:noProof/>
+        </w:rPr>
         <w:drawing>
-          <wp:inline distT="0" distB="0" distL="0" distR="0" wp14:anchorId="31DF7B9E" wp14:editId="67E0C216">
-            <wp:extent cx="3261360" cy="1743815"/>
-            <wp:effectExtent l="0" t="0" r="0" b="8890"/>
+          <wp:inline distT="0" distB="0" distL="0" distR="0" wp14:anchorId="31DF7B9E" wp14:editId="4B5D132C">
+            <wp:extent cx="3420301" cy="1828800"/>
+            <wp:effectExtent l="0" t="0" r="8890" b="0"/>
             <wp:docPr id="1649716453" name="Imagen 1"/>
             <wp:cNvGraphicFramePr>
               <a:graphicFrameLocks xmlns:a="http://schemas.openxmlformats.org/drawingml/2006/main" noChangeAspect="1"/>
@@ -512,7 +542,7 @@
                   <pic:spPr>
                     <a:xfrm>
                       <a:off x="0" y="0"/>
-                      <a:ext cx="3279465" cy="1753496"/>
+                      <a:ext cx="3455044" cy="1847377"/>
                     </a:xfrm>
                     <a:prstGeom prst="rect">
                       <a:avLst/>
@@ -535,10 +565,13 @@
         <w:pStyle w:val="Sinespaciado"/>
       </w:pPr>
       <w:r>
+        <w:rPr>
+          <w:noProof/>
+        </w:rPr>
         <w:drawing>
-          <wp:inline distT="0" distB="0" distL="0" distR="0" wp14:anchorId="797DEAD9" wp14:editId="72896DA7">
-            <wp:extent cx="3276600" cy="1675674"/>
-            <wp:effectExtent l="0" t="0" r="0" b="1270"/>
+          <wp:inline distT="0" distB="0" distL="0" distR="0" wp14:anchorId="797DEAD9" wp14:editId="6BEB65C6">
+            <wp:extent cx="3501521" cy="1790700"/>
+            <wp:effectExtent l="0" t="0" r="3810" b="0"/>
             <wp:docPr id="889350670" name="Imagen 1"/>
             <wp:cNvGraphicFramePr>
               <a:graphicFrameLocks xmlns:a="http://schemas.openxmlformats.org/drawingml/2006/main" noChangeAspect="1"/>
@@ -559,7 +592,7 @@
                   <pic:spPr>
                     <a:xfrm>
                       <a:off x="0" y="0"/>
-                      <a:ext cx="3290108" cy="1682582"/>
+                      <a:ext cx="3521522" cy="1800929"/>
                     </a:xfrm>
                     <a:prstGeom prst="rect">
                       <a:avLst/>
@@ -582,10 +615,13 @@
         <w:pStyle w:val="Sinespaciado"/>
       </w:pPr>
       <w:r>
+        <w:rPr>
+          <w:noProof/>
+        </w:rPr>
         <w:drawing>
-          <wp:inline distT="0" distB="0" distL="0" distR="0" wp14:anchorId="18E77776" wp14:editId="4934B4F7">
-            <wp:extent cx="3291840" cy="1773661"/>
-            <wp:effectExtent l="0" t="0" r="3810" b="0"/>
+          <wp:inline distT="0" distB="0" distL="0" distR="0" wp14:anchorId="18E77776" wp14:editId="0B4EED50">
+            <wp:extent cx="3535600" cy="1905000"/>
+            <wp:effectExtent l="0" t="0" r="8255" b="0"/>
             <wp:docPr id="1760669852" name="Imagen 1"/>
             <wp:cNvGraphicFramePr>
               <a:graphicFrameLocks xmlns:a="http://schemas.openxmlformats.org/drawingml/2006/main" noChangeAspect="1"/>
@@ -606,7 +642,7 @@
                   <pic:spPr>
                     <a:xfrm>
                       <a:off x="0" y="0"/>
-                      <a:ext cx="3301093" cy="1778646"/>
+                      <a:ext cx="3548110" cy="1911740"/>
                     </a:xfrm>
                     <a:prstGeom prst="rect">
                       <a:avLst/>
@@ -627,8 +663,16 @@
     <w:p>
       <w:pPr>
         <w:pStyle w:val="Sinespaciado"/>
-      </w:pPr>
-      <w:r>
+        <w:rPr>
+          <w:b/>
+          <w:bCs/>
+        </w:rPr>
+      </w:pPr>
+      <w:r>
+        <w:rPr>
+          <w:b/>
+          <w:bCs/>
+        </w:rPr>
         <w:lastRenderedPageBreak/>
         <w:t>NIVEL 3. EJERCICIO 5</w:t>
       </w:r>
@@ -641,18 +685,37 @@
         <w:t>Como podemos ver tanto el que aprende más rápido como el más estable es el Tanh</w:t>
       </w:r>
       <w:r>
-        <w:t xml:space="preserve"> aunque el ReLu no se queda muy lejos, cabe destacar que bajo ningún concepto en este caso utilizaría el Sigmoid puesto que tarda el doble en llegar al mismo error que los dos restantes.</w:t>
-      </w:r>
-    </w:p>
-    <w:p>
-      <w:pPr>
-        <w:pStyle w:val="Sinespaciado"/>
-      </w:pPr>
-      <w:r>
+        <w:t xml:space="preserve"> aunque el </w:t>
+      </w:r>
+      <w:proofErr w:type="spellStart"/>
+      <w:r>
+        <w:t>ReLu</w:t>
+      </w:r>
+      <w:proofErr w:type="spellEnd"/>
+      <w:r>
+        <w:t xml:space="preserve"> no se queda muy lejos, cabe destacar que bajo ningún concepto en este caso utilizaría el </w:t>
+      </w:r>
+      <w:proofErr w:type="spellStart"/>
+      <w:r>
+        <w:t>Sigmoid</w:t>
+      </w:r>
+      <w:proofErr w:type="spellEnd"/>
+      <w:r>
+        <w:t xml:space="preserve"> puesto que tarda el doble en llegar al mismo error que los dos restantes.</w:t>
+      </w:r>
+    </w:p>
+    <w:p>
+      <w:pPr>
+        <w:pStyle w:val="Sinespaciado"/>
+      </w:pPr>
+      <w:r>
+        <w:rPr>
+          <w:noProof/>
+        </w:rPr>
         <w:drawing>
-          <wp:inline distT="0" distB="0" distL="0" distR="0" wp14:anchorId="219550B3" wp14:editId="4AE0899F">
-            <wp:extent cx="4023360" cy="2007422"/>
-            <wp:effectExtent l="0" t="0" r="0" b="0"/>
+          <wp:inline distT="0" distB="0" distL="0" distR="0" wp14:anchorId="219550B3" wp14:editId="65F8400A">
+            <wp:extent cx="4337341" cy="2164080"/>
+            <wp:effectExtent l="0" t="0" r="6350" b="7620"/>
             <wp:docPr id="239530018" name="Imagen 1"/>
             <wp:cNvGraphicFramePr>
               <a:graphicFrameLocks xmlns:a="http://schemas.openxmlformats.org/drawingml/2006/main" noChangeAspect="1"/>
@@ -673,7 +736,7 @@
                   <pic:spPr>
                     <a:xfrm>
                       <a:off x="0" y="0"/>
-                      <a:ext cx="4028363" cy="2009918"/>
+                      <a:ext cx="4347210" cy="2169004"/>
                     </a:xfrm>
                     <a:prstGeom prst="rect">
                       <a:avLst/>
@@ -696,6 +759,9 @@
         <w:pStyle w:val="Sinespaciado"/>
       </w:pPr>
       <w:r>
+        <w:rPr>
+          <w:noProof/>
+        </w:rPr>
         <w:drawing>
           <wp:inline distT="0" distB="0" distL="0" distR="0" wp14:anchorId="259A0066" wp14:editId="45728A8E">
             <wp:extent cx="4282440" cy="2269633"/>
@@ -737,11 +803,19 @@
       <w:pPr>
         <w:pStyle w:val="Sinespaciado"/>
       </w:pPr>
-      <w:r>
+    </w:p>
+    <w:p>
+      <w:pPr>
+        <w:pStyle w:val="Sinespaciado"/>
+      </w:pPr>
+      <w:r>
+        <w:rPr>
+          <w:noProof/>
+        </w:rPr>
         <w:drawing>
-          <wp:inline distT="0" distB="0" distL="0" distR="0" wp14:anchorId="2DDDB03F" wp14:editId="0412E9FB">
-            <wp:extent cx="4785360" cy="2565997"/>
-            <wp:effectExtent l="0" t="0" r="0" b="6350"/>
+          <wp:inline distT="0" distB="0" distL="0" distR="0" wp14:anchorId="2DDDB03F" wp14:editId="35624EF7">
+            <wp:extent cx="4274820" cy="2292237"/>
+            <wp:effectExtent l="0" t="0" r="0" b="0"/>
             <wp:docPr id="1435786347" name="Imagen 1"/>
             <wp:cNvGraphicFramePr>
               <a:graphicFrameLocks xmlns:a="http://schemas.openxmlformats.org/drawingml/2006/main" noChangeAspect="1"/>
@@ -762,7 +836,7 @@
                   <pic:spPr>
                     <a:xfrm>
                       <a:off x="0" y="0"/>
-                      <a:ext cx="4790312" cy="2568653"/>
+                      <a:ext cx="4293371" cy="2302184"/>
                     </a:xfrm>
                     <a:prstGeom prst="rect">
                       <a:avLst/>
@@ -783,12 +857,24 @@
     <w:p>
       <w:pPr>
         <w:pStyle w:val="Sinespaciado"/>
-      </w:pPr>
-      <w:r>
+        <w:rPr>
+          <w:b/>
+          <w:bCs/>
+        </w:rPr>
+      </w:pPr>
+      <w:r>
+        <w:rPr>
+          <w:b/>
+          <w:bCs/>
+        </w:rPr>
         <w:lastRenderedPageBreak/>
         <w:t>NIVEL</w:t>
       </w:r>
       <w:r>
+        <w:rPr>
+          <w:b/>
+          <w:bCs/>
+        </w:rPr>
         <w:t xml:space="preserve"> 4. EJERCICIO 6</w:t>
       </w:r>
     </w:p>
@@ -797,14 +883,29 @@
         <w:pStyle w:val="Sinespaciado"/>
       </w:pPr>
       <w:r>
-        <w:t>Es mucho más rápido cuando utilizamos 2 capas de 3 neuronas, hablando de más o menos la mitad del tiempo. De una forma ganamos tiempo pero necesitamos más recursos y la otra forma necesitamos más tiempo pero gastamos menos recursos.</w:t>
-      </w:r>
-    </w:p>
-    <w:p>
-      <w:pPr>
-        <w:pStyle w:val="Sinespaciado"/>
-      </w:pPr>
-      <w:r>
+        <w:t xml:space="preserve">Es mucho más rápido cuando utilizamos 2 capas de 3 neuronas, hablando de más o menos la mitad del tiempo. De una forma ganamos </w:t>
+      </w:r>
+      <w:r>
+        <w:t>tiempo,</w:t>
+      </w:r>
+      <w:r>
+        <w:t xml:space="preserve"> pero necesitamos más recursos y la otra forma necesitamos más </w:t>
+      </w:r>
+      <w:r>
+        <w:t>tiempo,</w:t>
+      </w:r>
+      <w:r>
+        <w:t xml:space="preserve"> pero gastamos menos recursos.</w:t>
+      </w:r>
+    </w:p>
+    <w:p>
+      <w:pPr>
+        <w:pStyle w:val="Sinespaciado"/>
+      </w:pPr>
+      <w:r>
+        <w:rPr>
+          <w:noProof/>
+        </w:rPr>
         <w:drawing>
           <wp:inline distT="0" distB="0" distL="0" distR="0" wp14:anchorId="5A6AAE90" wp14:editId="51F99A18">
             <wp:extent cx="5400040" cy="2785745"/>
@@ -852,6 +953,9 @@
         <w:pStyle w:val="Sinespaciado"/>
       </w:pPr>
       <w:r>
+        <w:rPr>
+          <w:noProof/>
+        </w:rPr>
         <w:drawing>
           <wp:inline distT="0" distB="0" distL="0" distR="0" wp14:anchorId="0C34C629" wp14:editId="414DA674">
             <wp:extent cx="5400040" cy="2811780"/>
@@ -897,8 +1001,16 @@
     <w:p>
       <w:pPr>
         <w:pStyle w:val="Sinespaciado"/>
-      </w:pPr>
-      <w:r>
+        <w:rPr>
+          <w:b/>
+          <w:bCs/>
+        </w:rPr>
+      </w:pPr>
+      <w:r>
+        <w:rPr>
+          <w:b/>
+          <w:bCs/>
+        </w:rPr>
         <w:lastRenderedPageBreak/>
         <w:t>NIVEL 5. EJERCICIO 7</w:t>
       </w:r>
@@ -910,12 +1022,21 @@
       <w:r>
         <w:t>No se vuelve muy inestable, sin embargo, si hay puntos en los que aprende ruido</w:t>
       </w:r>
-    </w:p>
-    <w:p>
-      <w:pPr>
-        <w:pStyle w:val="Sinespaciado"/>
-      </w:pPr>
-      <w:r>
+      <w:r>
+        <w:t xml:space="preserve"> lo cual es peor que otros ejemplos que hemos visto anteriormente</w:t>
+      </w:r>
+      <w:r>
+        <w:t>.</w:t>
+      </w:r>
+    </w:p>
+    <w:p>
+      <w:pPr>
+        <w:pStyle w:val="Sinespaciado"/>
+      </w:pPr>
+      <w:r>
+        <w:rPr>
+          <w:noProof/>
+        </w:rPr>
         <w:drawing>
           <wp:inline distT="0" distB="0" distL="0" distR="0" wp14:anchorId="5095DBF1" wp14:editId="0174D829">
             <wp:extent cx="5400040" cy="2944495"/>
@@ -941,6 +1062,325 @@
                     <a:xfrm>
                       <a:off x="0" y="0"/>
                       <a:ext cx="5400040" cy="2944495"/>
+                    </a:xfrm>
+                    <a:prstGeom prst="rect">
+                      <a:avLst/>
+                    </a:prstGeom>
+                  </pic:spPr>
+                </pic:pic>
+              </a:graphicData>
+            </a:graphic>
+          </wp:inline>
+        </w:drawing>
+      </w:r>
+    </w:p>
+    <w:p>
+      <w:r>
+        <w:br w:type="page"/>
+      </w:r>
+    </w:p>
+    <w:p>
+      <w:pPr>
+        <w:pStyle w:val="Sinespaciado"/>
+        <w:rPr>
+          <w:b/>
+          <w:bCs/>
+        </w:rPr>
+      </w:pPr>
+      <w:r>
+        <w:rPr>
+          <w:b/>
+          <w:bCs/>
+        </w:rPr>
+        <w:lastRenderedPageBreak/>
+        <w:t>NIVEL 6. EJERCICIO 8</w:t>
+      </w:r>
+    </w:p>
+    <w:p>
+      <w:pPr>
+        <w:pStyle w:val="Sinespaciado"/>
+      </w:pPr>
+      <w:r>
+        <w:t>El aprendizaje en el primero explota cuando pasan unas 5 mil etapas aproximadamente</w:t>
+      </w:r>
+      <w:r>
+        <w:t>.</w:t>
+      </w:r>
+    </w:p>
+    <w:p>
+      <w:pPr>
+        <w:pStyle w:val="Sinespaciado"/>
+      </w:pPr>
+      <w:r>
+        <w:t xml:space="preserve">En la segunda, con el </w:t>
+      </w:r>
+      <w:proofErr w:type="spellStart"/>
+      <w:r>
+        <w:t>learning</w:t>
+      </w:r>
+      <w:proofErr w:type="spellEnd"/>
+      <w:r>
+        <w:t xml:space="preserve"> </w:t>
+      </w:r>
+      <w:proofErr w:type="spellStart"/>
+      <w:r>
+        <w:t>rate</w:t>
+      </w:r>
+      <w:proofErr w:type="spellEnd"/>
+      <w:r>
+        <w:t xml:space="preserve"> </w:t>
+      </w:r>
+      <w:r>
+        <w:t xml:space="preserve">más </w:t>
+      </w:r>
+      <w:r>
+        <w:t>alto,</w:t>
+      </w:r>
+      <w:r>
+        <w:t xml:space="preserve"> pero tarda también aproximadamente unas mil </w:t>
+      </w:r>
+      <w:r>
+        <w:t>etapas,</w:t>
+      </w:r>
+      <w:r>
+        <w:t xml:space="preserve"> pero con un error muy bajo</w:t>
+      </w:r>
+    </w:p>
+    <w:p>
+      <w:pPr>
+        <w:pStyle w:val="Sinespaciado"/>
+      </w:pPr>
+      <w:r>
+        <w:t xml:space="preserve">Y con un </w:t>
+      </w:r>
+      <w:proofErr w:type="spellStart"/>
+      <w:r>
+        <w:t>learning</w:t>
+      </w:r>
+      <w:proofErr w:type="spellEnd"/>
+      <w:r>
+        <w:t xml:space="preserve"> </w:t>
+      </w:r>
+      <w:proofErr w:type="spellStart"/>
+      <w:r>
+        <w:t>rate</w:t>
+      </w:r>
+      <w:proofErr w:type="spellEnd"/>
+      <w:r>
+        <w:t xml:space="preserve"> de 1 tiene </w:t>
+      </w:r>
+      <w:r>
+        <w:t>un aprendizaje muy rápido y estable.</w:t>
+      </w:r>
+    </w:p>
+    <w:p>
+      <w:pPr>
+        <w:pStyle w:val="Sinespaciado"/>
+      </w:pPr>
+      <w:r>
+        <w:drawing>
+          <wp:inline distT="0" distB="0" distL="0" distR="0" wp14:anchorId="1775381A" wp14:editId="6519D63D">
+            <wp:extent cx="4069080" cy="2210146"/>
+            <wp:effectExtent l="0" t="0" r="7620" b="0"/>
+            <wp:docPr id="2047953990" name="Imagen 1"/>
+            <wp:cNvGraphicFramePr>
+              <a:graphicFrameLocks xmlns:a="http://schemas.openxmlformats.org/drawingml/2006/main" noChangeAspect="1"/>
+            </wp:cNvGraphicFramePr>
+            <a:graphic xmlns:a="http://schemas.openxmlformats.org/drawingml/2006/main">
+              <a:graphicData uri="http://schemas.openxmlformats.org/drawingml/2006/picture">
+                <pic:pic xmlns:pic="http://schemas.openxmlformats.org/drawingml/2006/picture">
+                  <pic:nvPicPr>
+                    <pic:cNvPr id="2047953990" name=""/>
+                    <pic:cNvPicPr/>
+                  </pic:nvPicPr>
+                  <pic:blipFill>
+                    <a:blip r:embed="rId20"/>
+                    <a:stretch>
+                      <a:fillRect/>
+                    </a:stretch>
+                  </pic:blipFill>
+                  <pic:spPr>
+                    <a:xfrm>
+                      <a:off x="0" y="0"/>
+                      <a:ext cx="4087879" cy="2220357"/>
+                    </a:xfrm>
+                    <a:prstGeom prst="rect">
+                      <a:avLst/>
+                    </a:prstGeom>
+                  </pic:spPr>
+                </pic:pic>
+              </a:graphicData>
+            </a:graphic>
+          </wp:inline>
+        </w:drawing>
+      </w:r>
+    </w:p>
+    <w:p>
+      <w:pPr>
+        <w:pStyle w:val="Sinespaciado"/>
+      </w:pPr>
+    </w:p>
+    <w:p>
+      <w:pPr>
+        <w:pStyle w:val="Sinespaciado"/>
+      </w:pPr>
+      <w:r>
+        <w:drawing>
+          <wp:inline distT="0" distB="0" distL="0" distR="0" wp14:anchorId="4FC0E03D" wp14:editId="5D95FB6C">
+            <wp:extent cx="4152900" cy="2096961"/>
+            <wp:effectExtent l="0" t="0" r="0" b="0"/>
+            <wp:docPr id="1837537729" name="Imagen 1"/>
+            <wp:cNvGraphicFramePr>
+              <a:graphicFrameLocks xmlns:a="http://schemas.openxmlformats.org/drawingml/2006/main" noChangeAspect="1"/>
+            </wp:cNvGraphicFramePr>
+            <a:graphic xmlns:a="http://schemas.openxmlformats.org/drawingml/2006/main">
+              <a:graphicData uri="http://schemas.openxmlformats.org/drawingml/2006/picture">
+                <pic:pic xmlns:pic="http://schemas.openxmlformats.org/drawingml/2006/picture">
+                  <pic:nvPicPr>
+                    <pic:cNvPr id="1837537729" name=""/>
+                    <pic:cNvPicPr/>
+                  </pic:nvPicPr>
+                  <pic:blipFill>
+                    <a:blip r:embed="rId21"/>
+                    <a:stretch>
+                      <a:fillRect/>
+                    </a:stretch>
+                  </pic:blipFill>
+                  <pic:spPr>
+                    <a:xfrm>
+                      <a:off x="0" y="0"/>
+                      <a:ext cx="4170692" cy="2105945"/>
+                    </a:xfrm>
+                    <a:prstGeom prst="rect">
+                      <a:avLst/>
+                    </a:prstGeom>
+                  </pic:spPr>
+                </pic:pic>
+              </a:graphicData>
+            </a:graphic>
+          </wp:inline>
+        </w:drawing>
+      </w:r>
+    </w:p>
+    <w:p>
+      <w:pPr>
+        <w:pStyle w:val="Sinespaciado"/>
+      </w:pPr>
+    </w:p>
+    <w:p>
+      <w:pPr>
+        <w:pStyle w:val="Sinespaciado"/>
+      </w:pPr>
+      <w:r>
+        <w:drawing>
+          <wp:inline distT="0" distB="0" distL="0" distR="0" wp14:anchorId="2DE19242" wp14:editId="180FAE30">
+            <wp:extent cx="4251960" cy="2194479"/>
+            <wp:effectExtent l="0" t="0" r="0" b="0"/>
+            <wp:docPr id="864866002" name="Imagen 1"/>
+            <wp:cNvGraphicFramePr>
+              <a:graphicFrameLocks xmlns:a="http://schemas.openxmlformats.org/drawingml/2006/main" noChangeAspect="1"/>
+            </wp:cNvGraphicFramePr>
+            <a:graphic xmlns:a="http://schemas.openxmlformats.org/drawingml/2006/main">
+              <a:graphicData uri="http://schemas.openxmlformats.org/drawingml/2006/picture">
+                <pic:pic xmlns:pic="http://schemas.openxmlformats.org/drawingml/2006/picture">
+                  <pic:nvPicPr>
+                    <pic:cNvPr id="864866002" name=""/>
+                    <pic:cNvPicPr/>
+                  </pic:nvPicPr>
+                  <pic:blipFill>
+                    <a:blip r:embed="rId22"/>
+                    <a:stretch>
+                      <a:fillRect/>
+                    </a:stretch>
+                  </pic:blipFill>
+                  <pic:spPr>
+                    <a:xfrm>
+                      <a:off x="0" y="0"/>
+                      <a:ext cx="4258053" cy="2197624"/>
+                    </a:xfrm>
+                    <a:prstGeom prst="rect">
+                      <a:avLst/>
+                    </a:prstGeom>
+                  </pic:spPr>
+                </pic:pic>
+              </a:graphicData>
+            </a:graphic>
+          </wp:inline>
+        </w:drawing>
+      </w:r>
+    </w:p>
+    <w:p>
+      <w:r>
+        <w:br w:type="page"/>
+      </w:r>
+    </w:p>
+    <w:p>
+      <w:pPr>
+        <w:pStyle w:val="Sinespaciado"/>
+        <w:rPr>
+          <w:b/>
+          <w:bCs/>
+        </w:rPr>
+      </w:pPr>
+      <w:r>
+        <w:rPr>
+          <w:b/>
+          <w:bCs/>
+        </w:rPr>
+        <w:lastRenderedPageBreak/>
+        <w:t>NIVEL 7. EJERCICIO 9</w:t>
+      </w:r>
+    </w:p>
+    <w:p>
+      <w:pPr>
+        <w:pStyle w:val="Sinespaciado"/>
+      </w:pPr>
+      <w:r>
+        <w:t>La arquitectura más eficiente es 1 capa con 3 neuronas, aunque en l</w:t>
+      </w:r>
+      <w:r>
+        <w:t xml:space="preserve">a imagen se vea que hemos llegado a las mil etapas, no es necesario apurar tanto para conseguir la división correcta de los datos, por lo tanto es rápida, </w:t>
+      </w:r>
+      <w:r>
+        <w:t>precisa</w:t>
+      </w:r>
+      <w:r>
+        <w:t xml:space="preserve"> y eficiente puesto que tenemos una red neuronal</w:t>
+      </w:r>
+      <w:r>
+        <w:t xml:space="preserve"> con 3 neuronas, no hace falta implementar diferentes capas</w:t>
+      </w:r>
+    </w:p>
+    <w:p>
+      <w:pPr>
+        <w:pStyle w:val="Sinespaciado"/>
+      </w:pPr>
+      <w:r>
+        <w:drawing>
+          <wp:inline distT="0" distB="0" distL="0" distR="0" wp14:anchorId="0A827D5D" wp14:editId="325D0E8D">
+            <wp:extent cx="5400040" cy="2881630"/>
+            <wp:effectExtent l="0" t="0" r="0" b="0"/>
+            <wp:docPr id="1086331806" name="Imagen 1"/>
+            <wp:cNvGraphicFramePr>
+              <a:graphicFrameLocks xmlns:a="http://schemas.openxmlformats.org/drawingml/2006/main" noChangeAspect="1"/>
+            </wp:cNvGraphicFramePr>
+            <a:graphic xmlns:a="http://schemas.openxmlformats.org/drawingml/2006/main">
+              <a:graphicData uri="http://schemas.openxmlformats.org/drawingml/2006/picture">
+                <pic:pic xmlns:pic="http://schemas.openxmlformats.org/drawingml/2006/picture">
+                  <pic:nvPicPr>
+                    <pic:cNvPr id="1086331806" name=""/>
+                    <pic:cNvPicPr/>
+                  </pic:nvPicPr>
+                  <pic:blipFill>
+                    <a:blip r:embed="rId23"/>
+                    <a:stretch>
+                      <a:fillRect/>
+                    </a:stretch>
+                  </pic:blipFill>
+                  <pic:spPr>
+                    <a:xfrm>
+                      <a:off x="0" y="0"/>
+                      <a:ext cx="5400040" cy="2881630"/>
                     </a:xfrm>
                     <a:prstGeom prst="rect">
                       <a:avLst/>

</xml_diff>